<commit_message>
day-4 along with assignment
</commit_message>
<xml_diff>
--- a/Day-4.docx
+++ b/Day-4.docx
@@ -10244,7 +10244,10 @@
       <w:pPr>
         <w:spacing w:after="0" w:line="240" w:lineRule="auto"/>
         <w:rPr>
-          <w:rFonts w:ascii="Times New Roman" w:eastAsia="Times New Roman" w:hAnsi="Times New Roman" w:cs="Times New Roman"/>
+          <w:rFonts w:ascii="Comic Sans MS" w:eastAsia="Times New Roman" w:hAnsi="Comic Sans MS" w:cs="Times New Roman"/>
+          <w:b/>
+          <w:bCs/>
+          <w:color w:val="000000"/>
           <w:sz w:val="24"/>
           <w:szCs w:val="24"/>
         </w:rPr>
@@ -10262,6 +10265,27 @@
       </w:r>
     </w:p>
     <w:p>
+      <w:pPr>
+        <w:spacing w:after="0" w:line="240" w:lineRule="auto"/>
+        <w:rPr>
+          <w:rFonts w:ascii="Times New Roman" w:eastAsia="Times New Roman" w:hAnsi="Times New Roman" w:cs="Times New Roman"/>
+          <w:sz w:val="24"/>
+          <w:szCs w:val="24"/>
+        </w:rPr>
+      </w:pPr>
+      <w:r>
+        <w:rPr>
+          <w:rFonts w:ascii="Comic Sans MS" w:eastAsia="Times New Roman" w:hAnsi="Comic Sans MS" w:cs="Times New Roman"/>
+          <w:b/>
+          <w:bCs/>
+          <w:color w:val="000000"/>
+          <w:sz w:val="24"/>
+          <w:szCs w:val="24"/>
+        </w:rPr>
+        <w:t>Answer:</w:t>
+      </w:r>
+    </w:p>
+    <w:p>
       <w:r>
         <w:rPr>
           <w:rFonts w:ascii="Times New Roman" w:eastAsia="Times New Roman" w:hAnsi="Times New Roman" w:cs="Times New Roman"/>
@@ -10269,6 +10293,798 @@
           <w:szCs w:val="24"/>
         </w:rPr>
         <w:br/>
+      </w:r>
+      <w:proofErr w:type="spellStart"/>
+      <w:proofErr w:type="gramStart"/>
+      <w:r>
+        <w:t>mysql</w:t>
+      </w:r>
+      <w:proofErr w:type="spellEnd"/>
+      <w:proofErr w:type="gramEnd"/>
+      <w:r>
+        <w:t>&gt; create database pfs7;</w:t>
+      </w:r>
+    </w:p>
+    <w:p>
+      <w:r>
+        <w:t>Query OK, 1 row affected (0.01 sec)</w:t>
+      </w:r>
+    </w:p>
+    <w:p/>
+    <w:p>
+      <w:proofErr w:type="spellStart"/>
+      <w:proofErr w:type="gramStart"/>
+      <w:r>
+        <w:t>mysql</w:t>
+      </w:r>
+      <w:proofErr w:type="spellEnd"/>
+      <w:proofErr w:type="gramEnd"/>
+      <w:r>
+        <w:t>&gt; use pfs7;</w:t>
+      </w:r>
+    </w:p>
+    <w:p>
+      <w:r>
+        <w:t>Database changed</w:t>
+      </w:r>
+    </w:p>
+    <w:p>
+      <w:proofErr w:type="spellStart"/>
+      <w:proofErr w:type="gramStart"/>
+      <w:r>
+        <w:t>mysql</w:t>
+      </w:r>
+      <w:proofErr w:type="spellEnd"/>
+      <w:proofErr w:type="gramEnd"/>
+      <w:r>
+        <w:t xml:space="preserve">&gt; create table </w:t>
+      </w:r>
+      <w:proofErr w:type="spellStart"/>
+      <w:r>
+        <w:t>company_staff</w:t>
+      </w:r>
+      <w:proofErr w:type="spellEnd"/>
+      <w:r>
+        <w:t>(</w:t>
+      </w:r>
+    </w:p>
+    <w:p>
+      <w:r>
+        <w:t xml:space="preserve">    -&gt; </w:t>
+      </w:r>
+      <w:proofErr w:type="spellStart"/>
+      <w:proofErr w:type="gramStart"/>
+      <w:r>
+        <w:t>emp_id</w:t>
+      </w:r>
+      <w:proofErr w:type="spellEnd"/>
+      <w:proofErr w:type="gramEnd"/>
+      <w:r>
+        <w:t xml:space="preserve"> </w:t>
+      </w:r>
+      <w:proofErr w:type="spellStart"/>
+      <w:r>
+        <w:t>int</w:t>
+      </w:r>
+      <w:proofErr w:type="spellEnd"/>
+      <w:r>
+        <w:t>,</w:t>
+      </w:r>
+    </w:p>
+    <w:p>
+      <w:r>
+        <w:t xml:space="preserve">    -&gt; </w:t>
+      </w:r>
+      <w:proofErr w:type="gramStart"/>
+      <w:r>
+        <w:t>age</w:t>
+      </w:r>
+      <w:proofErr w:type="gramEnd"/>
+      <w:r>
+        <w:t xml:space="preserve"> </w:t>
+      </w:r>
+      <w:proofErr w:type="spellStart"/>
+      <w:r>
+        <w:t>tinyint</w:t>
+      </w:r>
+      <w:proofErr w:type="spellEnd"/>
+      <w:r>
+        <w:t>,</w:t>
+      </w:r>
+    </w:p>
+    <w:p>
+      <w:r>
+        <w:t xml:space="preserve">    -&gt; </w:t>
+      </w:r>
+      <w:proofErr w:type="gramStart"/>
+      <w:r>
+        <w:t>experience</w:t>
+      </w:r>
+      <w:proofErr w:type="gramEnd"/>
+      <w:r>
+        <w:t xml:space="preserve"> </w:t>
+      </w:r>
+      <w:proofErr w:type="spellStart"/>
+      <w:r>
+        <w:t>smallint</w:t>
+      </w:r>
+      <w:proofErr w:type="spellEnd"/>
+      <w:r>
+        <w:t>,</w:t>
+      </w:r>
+    </w:p>
+    <w:p>
+      <w:r>
+        <w:t xml:space="preserve">    -&gt; </w:t>
+      </w:r>
+      <w:proofErr w:type="gramStart"/>
+      <w:r>
+        <w:t>gender</w:t>
+      </w:r>
+      <w:proofErr w:type="gramEnd"/>
+      <w:r>
+        <w:t xml:space="preserve"> char(1),</w:t>
+      </w:r>
+    </w:p>
+    <w:p>
+      <w:r>
+        <w:t xml:space="preserve">    -&gt; </w:t>
+      </w:r>
+      <w:proofErr w:type="spellStart"/>
+      <w:proofErr w:type="gramStart"/>
+      <w:r>
+        <w:t>emp_name</w:t>
+      </w:r>
+      <w:proofErr w:type="spellEnd"/>
+      <w:proofErr w:type="gramEnd"/>
+      <w:r>
+        <w:t xml:space="preserve"> </w:t>
+      </w:r>
+      <w:proofErr w:type="spellStart"/>
+      <w:r>
+        <w:t>varchar</w:t>
+      </w:r>
+      <w:proofErr w:type="spellEnd"/>
+      <w:r>
+        <w:t>(50),</w:t>
+      </w:r>
+    </w:p>
+    <w:p>
+      <w:r>
+        <w:t xml:space="preserve">    -&gt; </w:t>
+      </w:r>
+      <w:proofErr w:type="gramStart"/>
+      <w:r>
+        <w:t>address</w:t>
+      </w:r>
+      <w:proofErr w:type="gramEnd"/>
+      <w:r>
+        <w:t xml:space="preserve"> </w:t>
+      </w:r>
+      <w:proofErr w:type="spellStart"/>
+      <w:r>
+        <w:t>tinytext</w:t>
+      </w:r>
+      <w:proofErr w:type="spellEnd"/>
+      <w:r>
+        <w:t>,</w:t>
+      </w:r>
+    </w:p>
+    <w:p>
+      <w:r>
+        <w:t xml:space="preserve">    -&gt; </w:t>
+      </w:r>
+      <w:proofErr w:type="gramStart"/>
+      <w:r>
+        <w:t>salary</w:t>
+      </w:r>
+      <w:proofErr w:type="gramEnd"/>
+      <w:r>
+        <w:t xml:space="preserve"> decimal(10,2),</w:t>
+      </w:r>
+    </w:p>
+    <w:p>
+      <w:r>
+        <w:t xml:space="preserve">    -&gt; </w:t>
+      </w:r>
+      <w:proofErr w:type="gramStart"/>
+      <w:r>
+        <w:t>department</w:t>
+      </w:r>
+      <w:proofErr w:type="gramEnd"/>
+      <w:r>
+        <w:t xml:space="preserve"> </w:t>
+      </w:r>
+      <w:proofErr w:type="spellStart"/>
+      <w:r>
+        <w:t>enum</w:t>
+      </w:r>
+      <w:proofErr w:type="spellEnd"/>
+      <w:r>
+        <w:t>('</w:t>
+      </w:r>
+      <w:proofErr w:type="spellStart"/>
+      <w:r>
+        <w:t>HR','IT','Sales','Finance','Support</w:t>
+      </w:r>
+      <w:proofErr w:type="spellEnd"/>
+      <w:r>
+        <w:t>'),</w:t>
+      </w:r>
+    </w:p>
+    <w:p>
+      <w:r>
+        <w:t xml:space="preserve">    -&gt; </w:t>
+      </w:r>
+      <w:proofErr w:type="gramStart"/>
+      <w:r>
+        <w:t>skills</w:t>
+      </w:r>
+      <w:proofErr w:type="gramEnd"/>
+      <w:r>
+        <w:t xml:space="preserve"> set('</w:t>
+      </w:r>
+      <w:proofErr w:type="spellStart"/>
+      <w:r>
+        <w:t>Java','Python','SQL','Excel','Communication</w:t>
+      </w:r>
+      <w:proofErr w:type="spellEnd"/>
+      <w:r>
+        <w:t>'),</w:t>
+      </w:r>
+    </w:p>
+    <w:p>
+      <w:r>
+        <w:t xml:space="preserve">    -&gt; </w:t>
+      </w:r>
+      <w:proofErr w:type="spellStart"/>
+      <w:r>
+        <w:t>joining_date</w:t>
+      </w:r>
+      <w:proofErr w:type="spellEnd"/>
+    </w:p>
+    <w:p>
+      <w:r>
+        <w:t xml:space="preserve">    -&gt; );</w:t>
+      </w:r>
+    </w:p>
+    <w:p>
+      <w:r>
+        <w:lastRenderedPageBreak/>
+        <w:t xml:space="preserve">ERROR 1064 (42000): You have an error in your SQL syntax; check the manual that corresponds to your </w:t>
+      </w:r>
+      <w:proofErr w:type="spellStart"/>
+      <w:r>
+        <w:t>MySQL</w:t>
+      </w:r>
+      <w:proofErr w:type="spellEnd"/>
+      <w:r>
+        <w:t xml:space="preserve"> server version for the right syntax to use near ')' at line 12</w:t>
+      </w:r>
+    </w:p>
+    <w:p>
+      <w:proofErr w:type="spellStart"/>
+      <w:proofErr w:type="gramStart"/>
+      <w:r>
+        <w:t>mysql</w:t>
+      </w:r>
+      <w:proofErr w:type="spellEnd"/>
+      <w:proofErr w:type="gramEnd"/>
+      <w:r>
+        <w:t>&gt; ^C</w:t>
+      </w:r>
+    </w:p>
+    <w:p>
+      <w:proofErr w:type="spellStart"/>
+      <w:proofErr w:type="gramStart"/>
+      <w:r>
+        <w:t>mysql</w:t>
+      </w:r>
+      <w:proofErr w:type="spellEnd"/>
+      <w:proofErr w:type="gramEnd"/>
+      <w:r>
+        <w:t xml:space="preserve">&gt; create table </w:t>
+      </w:r>
+      <w:proofErr w:type="spellStart"/>
+      <w:r>
+        <w:t>company_staff</w:t>
+      </w:r>
+      <w:proofErr w:type="spellEnd"/>
+      <w:r>
+        <w:t>(</w:t>
+      </w:r>
+    </w:p>
+    <w:p>
+      <w:r>
+        <w:t xml:space="preserve">    -&gt; </w:t>
+      </w:r>
+      <w:proofErr w:type="spellStart"/>
+      <w:proofErr w:type="gramStart"/>
+      <w:r>
+        <w:t>emp_id</w:t>
+      </w:r>
+      <w:proofErr w:type="spellEnd"/>
+      <w:proofErr w:type="gramEnd"/>
+      <w:r>
+        <w:t xml:space="preserve"> </w:t>
+      </w:r>
+      <w:proofErr w:type="spellStart"/>
+      <w:r>
+        <w:t>int</w:t>
+      </w:r>
+      <w:proofErr w:type="spellEnd"/>
+      <w:r>
+        <w:t>,</w:t>
+      </w:r>
+    </w:p>
+    <w:p>
+      <w:r>
+        <w:t xml:space="preserve">    -&gt; </w:t>
+      </w:r>
+      <w:proofErr w:type="gramStart"/>
+      <w:r>
+        <w:t>age</w:t>
+      </w:r>
+      <w:proofErr w:type="gramEnd"/>
+      <w:r>
+        <w:t xml:space="preserve"> </w:t>
+      </w:r>
+      <w:proofErr w:type="spellStart"/>
+      <w:r>
+        <w:t>tinyint</w:t>
+      </w:r>
+      <w:proofErr w:type="spellEnd"/>
+      <w:r>
+        <w:t>,</w:t>
+      </w:r>
+    </w:p>
+    <w:p>
+      <w:r>
+        <w:t xml:space="preserve">    -&gt; </w:t>
+      </w:r>
+      <w:proofErr w:type="gramStart"/>
+      <w:r>
+        <w:t>experience</w:t>
+      </w:r>
+      <w:proofErr w:type="gramEnd"/>
+      <w:r>
+        <w:t xml:space="preserve"> </w:t>
+      </w:r>
+      <w:proofErr w:type="spellStart"/>
+      <w:r>
+        <w:t>smallint</w:t>
+      </w:r>
+      <w:proofErr w:type="spellEnd"/>
+      <w:r>
+        <w:t>,</w:t>
+      </w:r>
+    </w:p>
+    <w:p>
+      <w:r>
+        <w:t xml:space="preserve">    -&gt; </w:t>
+      </w:r>
+      <w:proofErr w:type="gramStart"/>
+      <w:r>
+        <w:t>gender</w:t>
+      </w:r>
+      <w:proofErr w:type="gramEnd"/>
+      <w:r>
+        <w:t xml:space="preserve"> char(1),</w:t>
+      </w:r>
+    </w:p>
+    <w:p>
+      <w:r>
+        <w:t xml:space="preserve">    -&gt; </w:t>
+      </w:r>
+      <w:proofErr w:type="spellStart"/>
+      <w:proofErr w:type="gramStart"/>
+      <w:r>
+        <w:t>emp_name</w:t>
+      </w:r>
+      <w:proofErr w:type="spellEnd"/>
+      <w:proofErr w:type="gramEnd"/>
+      <w:r>
+        <w:t xml:space="preserve"> </w:t>
+      </w:r>
+      <w:proofErr w:type="spellStart"/>
+      <w:r>
+        <w:t>varchar</w:t>
+      </w:r>
+      <w:proofErr w:type="spellEnd"/>
+      <w:r>
+        <w:t>(50),</w:t>
+      </w:r>
+    </w:p>
+    <w:p>
+      <w:r>
+        <w:t xml:space="preserve">    -&gt; </w:t>
+      </w:r>
+      <w:proofErr w:type="gramStart"/>
+      <w:r>
+        <w:t>address</w:t>
+      </w:r>
+      <w:proofErr w:type="gramEnd"/>
+      <w:r>
+        <w:t xml:space="preserve"> </w:t>
+      </w:r>
+      <w:proofErr w:type="spellStart"/>
+      <w:r>
+        <w:t>tinytext</w:t>
+      </w:r>
+      <w:proofErr w:type="spellEnd"/>
+      <w:r>
+        <w:t>,</w:t>
+      </w:r>
+    </w:p>
+    <w:p>
+      <w:r>
+        <w:t xml:space="preserve">    -&gt; </w:t>
+      </w:r>
+      <w:proofErr w:type="gramStart"/>
+      <w:r>
+        <w:t>salary</w:t>
+      </w:r>
+      <w:proofErr w:type="gramEnd"/>
+      <w:r>
+        <w:t xml:space="preserve"> decimal(10,2),</w:t>
+      </w:r>
+    </w:p>
+    <w:p>
+      <w:r>
+        <w:t xml:space="preserve">    -&gt; </w:t>
+      </w:r>
+      <w:proofErr w:type="gramStart"/>
+      <w:r>
+        <w:t>department</w:t>
+      </w:r>
+      <w:proofErr w:type="gramEnd"/>
+      <w:r>
+        <w:t xml:space="preserve"> </w:t>
+      </w:r>
+      <w:proofErr w:type="spellStart"/>
+      <w:r>
+        <w:t>enum</w:t>
+      </w:r>
+      <w:proofErr w:type="spellEnd"/>
+      <w:r>
+        <w:t>('</w:t>
+      </w:r>
+      <w:proofErr w:type="spellStart"/>
+      <w:r>
+        <w:t>HR','IT','Sales','Finance','Support</w:t>
+      </w:r>
+      <w:proofErr w:type="spellEnd"/>
+      <w:r>
+        <w:t>'),</w:t>
+      </w:r>
+    </w:p>
+    <w:p>
+      <w:r>
+        <w:t xml:space="preserve">    -&gt; </w:t>
+      </w:r>
+      <w:proofErr w:type="gramStart"/>
+      <w:r>
+        <w:t>skills</w:t>
+      </w:r>
+      <w:proofErr w:type="gramEnd"/>
+      <w:r>
+        <w:t xml:space="preserve"> set('</w:t>
+      </w:r>
+      <w:proofErr w:type="spellStart"/>
+      <w:r>
+        <w:t>Java','Python','SQL','Excel','Communication</w:t>
+      </w:r>
+      <w:proofErr w:type="spellEnd"/>
+      <w:r>
+        <w:t>'),</w:t>
+      </w:r>
+    </w:p>
+    <w:p>
+      <w:r>
+        <w:t xml:space="preserve">    -&gt; </w:t>
+      </w:r>
+      <w:proofErr w:type="spellStart"/>
+      <w:proofErr w:type="gramStart"/>
+      <w:r>
+        <w:t>joining_date</w:t>
+      </w:r>
+      <w:proofErr w:type="spellEnd"/>
+      <w:proofErr w:type="gramEnd"/>
+      <w:r>
+        <w:t xml:space="preserve"> date</w:t>
+      </w:r>
+    </w:p>
+    <w:p>
+      <w:r>
+        <w:t xml:space="preserve">    -&gt; );</w:t>
+      </w:r>
+    </w:p>
+    <w:p>
+      <w:r>
+        <w:t>Query OK, 0 rows affected (0.05 sec)</w:t>
+      </w:r>
+    </w:p>
+    <w:p/>
+    <w:p>
+      <w:proofErr w:type="spellStart"/>
+      <w:proofErr w:type="gramStart"/>
+      <w:r>
+        <w:t>mysql</w:t>
+      </w:r>
+      <w:proofErr w:type="spellEnd"/>
+      <w:proofErr w:type="gramEnd"/>
+      <w:r>
+        <w:t xml:space="preserve">&gt; </w:t>
+      </w:r>
+      <w:proofErr w:type="spellStart"/>
+      <w:r>
+        <w:t>desc</w:t>
+      </w:r>
+      <w:proofErr w:type="spellEnd"/>
+      <w:r>
+        <w:t xml:space="preserve"> </w:t>
+      </w:r>
+      <w:proofErr w:type="spellStart"/>
+      <w:r>
+        <w:t>company_staff</w:t>
+      </w:r>
+      <w:proofErr w:type="spellEnd"/>
+      <w:r>
+        <w:t>;</w:t>
+      </w:r>
+    </w:p>
+    <w:p>
+      <w:r>
+        <w:t>+--------------+----------------------------------------------------+------+-----+---------+-------+</w:t>
+      </w:r>
+    </w:p>
+    <w:p>
+      <w:r>
+        <w:t>| Field        | Type                                               | Null | Key | Default | Extra |</w:t>
+      </w:r>
+    </w:p>
+    <w:p>
+      <w:r>
+        <w:t>+--------------+----------------------------------------------------+------+-----+---------+-------+</w:t>
+      </w:r>
+    </w:p>
+    <w:p>
+      <w:r>
+        <w:t xml:space="preserve">| </w:t>
+      </w:r>
+      <w:proofErr w:type="spellStart"/>
+      <w:r>
+        <w:t>emp_id</w:t>
+      </w:r>
+      <w:proofErr w:type="spellEnd"/>
+      <w:r>
+        <w:t xml:space="preserve">       | </w:t>
+      </w:r>
+      <w:proofErr w:type="spellStart"/>
+      <w:r>
+        <w:t>int</w:t>
+      </w:r>
+      <w:proofErr w:type="spellEnd"/>
+      <w:r>
+        <w:t xml:space="preserve">                                                | </w:t>
+      </w:r>
+      <w:proofErr w:type="gramStart"/>
+      <w:r>
+        <w:t>YES  |</w:t>
+      </w:r>
+      <w:proofErr w:type="gramEnd"/>
+      <w:r>
+        <w:t xml:space="preserve">     | NULL    |       |</w:t>
+      </w:r>
+    </w:p>
+    <w:p>
+      <w:r>
+        <w:t xml:space="preserve">| </w:t>
+      </w:r>
+      <w:proofErr w:type="gramStart"/>
+      <w:r>
+        <w:t>age</w:t>
+      </w:r>
+      <w:proofErr w:type="gramEnd"/>
+      <w:r>
+        <w:t xml:space="preserve">          | </w:t>
+      </w:r>
+      <w:proofErr w:type="spellStart"/>
+      <w:r>
+        <w:t>tinyint</w:t>
+      </w:r>
+      <w:proofErr w:type="spellEnd"/>
+      <w:r>
+        <w:t xml:space="preserve">                                            | YES  |     | NULL    |       |</w:t>
+      </w:r>
+    </w:p>
+    <w:p>
+      <w:r>
+        <w:t xml:space="preserve">| </w:t>
+      </w:r>
+      <w:proofErr w:type="gramStart"/>
+      <w:r>
+        <w:t>experience</w:t>
+      </w:r>
+      <w:proofErr w:type="gramEnd"/>
+      <w:r>
+        <w:t xml:space="preserve">   | </w:t>
+      </w:r>
+      <w:proofErr w:type="spellStart"/>
+      <w:r>
+        <w:t>smallint</w:t>
+      </w:r>
+      <w:proofErr w:type="spellEnd"/>
+      <w:r>
+        <w:t xml:space="preserve">                                           | YES  |     | NULL    |       |</w:t>
+      </w:r>
+    </w:p>
+    <w:p>
+      <w:r>
+        <w:t xml:space="preserve">| </w:t>
+      </w:r>
+      <w:proofErr w:type="gramStart"/>
+      <w:r>
+        <w:t>gender</w:t>
+      </w:r>
+      <w:proofErr w:type="gramEnd"/>
+      <w:r>
+        <w:t xml:space="preserve">       | char(1)                                            | YES  |     | NULL    |       |</w:t>
+      </w:r>
+    </w:p>
+    <w:p>
+      <w:r>
+        <w:t xml:space="preserve">| </w:t>
+      </w:r>
+      <w:proofErr w:type="spellStart"/>
+      <w:r>
+        <w:t>emp_name</w:t>
+      </w:r>
+      <w:proofErr w:type="spellEnd"/>
+      <w:r>
+        <w:t xml:space="preserve">     | </w:t>
+      </w:r>
+      <w:proofErr w:type="spellStart"/>
+      <w:proofErr w:type="gramStart"/>
+      <w:r>
+        <w:t>varchar</w:t>
+      </w:r>
+      <w:proofErr w:type="spellEnd"/>
+      <w:r>
+        <w:t>(</w:t>
+      </w:r>
+      <w:proofErr w:type="gramEnd"/>
+      <w:r>
+        <w:t>50)                                        | YES  |     | NULL    |       |</w:t>
+      </w:r>
+    </w:p>
+    <w:p>
+      <w:r>
+        <w:lastRenderedPageBreak/>
+        <w:t xml:space="preserve">| address      | </w:t>
+      </w:r>
+      <w:proofErr w:type="spellStart"/>
+      <w:r>
+        <w:t>tinytext</w:t>
+      </w:r>
+      <w:proofErr w:type="spellEnd"/>
+      <w:r>
+        <w:t xml:space="preserve">                                           | </w:t>
+      </w:r>
+      <w:proofErr w:type="gramStart"/>
+      <w:r>
+        <w:t>YES  |</w:t>
+      </w:r>
+      <w:proofErr w:type="gramEnd"/>
+      <w:r>
+        <w:t xml:space="preserve">     | NULL    |       |</w:t>
+      </w:r>
+    </w:p>
+    <w:p>
+      <w:r>
+        <w:t xml:space="preserve">| </w:t>
+      </w:r>
+      <w:proofErr w:type="gramStart"/>
+      <w:r>
+        <w:t>salary</w:t>
+      </w:r>
+      <w:proofErr w:type="gramEnd"/>
+      <w:r>
+        <w:t xml:space="preserve">       | decimal(10,2)                                      | YES  |     | NULL    |       |</w:t>
+      </w:r>
+    </w:p>
+    <w:p>
+      <w:r>
+        <w:t xml:space="preserve">| </w:t>
+      </w:r>
+      <w:proofErr w:type="gramStart"/>
+      <w:r>
+        <w:t>department</w:t>
+      </w:r>
+      <w:proofErr w:type="gramEnd"/>
+      <w:r>
+        <w:t xml:space="preserve">   | </w:t>
+      </w:r>
+      <w:proofErr w:type="spellStart"/>
+      <w:r>
+        <w:t>enum</w:t>
+      </w:r>
+      <w:proofErr w:type="spellEnd"/>
+      <w:r>
+        <w:t>('</w:t>
+      </w:r>
+      <w:proofErr w:type="spellStart"/>
+      <w:r>
+        <w:t>HR','IT','Sales','Finance','Support</w:t>
+      </w:r>
+      <w:proofErr w:type="spellEnd"/>
+      <w:r>
+        <w:t>')        | YES  |     | NULL    |       |</w:t>
+      </w:r>
+    </w:p>
+    <w:p>
+      <w:r>
+        <w:t xml:space="preserve">| </w:t>
+      </w:r>
+      <w:proofErr w:type="gramStart"/>
+      <w:r>
+        <w:t>skills</w:t>
+      </w:r>
+      <w:proofErr w:type="gramEnd"/>
+      <w:r>
+        <w:t xml:space="preserve">       | set('</w:t>
+      </w:r>
+      <w:proofErr w:type="spellStart"/>
+      <w:r>
+        <w:t>Java','Python','SQL','Excel','Communication</w:t>
+      </w:r>
+      <w:proofErr w:type="spellEnd"/>
+      <w:r>
+        <w:t>') | YES  |     | NULL    |       |</w:t>
+      </w:r>
+    </w:p>
+    <w:p>
+      <w:r>
+        <w:t xml:space="preserve">| </w:t>
+      </w:r>
+      <w:proofErr w:type="spellStart"/>
+      <w:r>
+        <w:t>joining_date</w:t>
+      </w:r>
+      <w:proofErr w:type="spellEnd"/>
+      <w:r>
+        <w:t xml:space="preserve"> | date                                               | </w:t>
+      </w:r>
+      <w:proofErr w:type="gramStart"/>
+      <w:r>
+        <w:t>YES  |</w:t>
+      </w:r>
+      <w:proofErr w:type="gramEnd"/>
+      <w:r>
+        <w:t xml:space="preserve">     | NULL    |       |</w:t>
+      </w:r>
+    </w:p>
+    <w:p>
+      <w:r>
+        <w:t>+--------------+----------------------------------------------------+------+-----+---------+-------+</w:t>
+      </w:r>
+    </w:p>
+    <w:p>
+      <w:r>
+        <w:t>10 rows in set (0.01 sec)</w:t>
+      </w:r>
+    </w:p>
+    <w:p/>
+    <w:p>
+      <w:proofErr w:type="spellStart"/>
+      <w:proofErr w:type="gramStart"/>
+      <w:r>
+        <w:t>mysql</w:t>
+      </w:r>
+      <w:proofErr w:type="spellEnd"/>
+      <w:proofErr w:type="gramEnd"/>
+      <w:r>
+        <w:t>&gt;</w:t>
       </w:r>
     </w:p>
     <w:sectPr>

</xml_diff>